<commit_message>
Sprint Backlog is added
</commit_message>
<xml_diff>
--- a/Assignment2/Requirements_v2.docx
+++ b/Assignment2/Requirements_v2.docx
@@ -1,6 +1,6 @@
 
 <file path=word/document.xml><?xml version="1.0" encoding="utf-8"?>
-<w:document xmlns:wpc="http://schemas.microsoft.com/office/word/2010/wordprocessingCanvas" xmlns:cx="http://schemas.microsoft.com/office/drawing/2014/chartex" xmlns:cx1="http://schemas.microsoft.com/office/drawing/2015/9/8/chartex" xmlns:cx2="http://schemas.microsoft.com/office/drawing/2015/10/21/chartex" xmlns:cx3="http://schemas.microsoft.com/office/drawing/2016/5/9/chartex" xmlns:cx4="http://schemas.microsoft.com/office/drawing/2016/5/10/chartex" xmlns:cx5="http://schemas.microsoft.com/office/drawing/2016/5/11/chartex" xmlns:cx6="http://schemas.microsoft.com/office/drawing/2016/5/12/chartex" xmlns:cx7="http://schemas.microsoft.com/office/drawing/2016/5/13/chartex" xmlns:cx8="http://schemas.microsoft.com/office/drawing/2016/5/14/chartex" xmlns:mc="http://schemas.openxmlformats.org/markup-compatibility/2006" xmlns:aink="http://schemas.microsoft.com/office/drawing/2016/ink" xmlns:am3d="http://schemas.microsoft.com/office/drawing/2017/model3d" xmlns:o="urn:schemas-microsoft-com:office:office" xmlns:oel="http://schemas.microsoft.com/office/2019/extlst" xmlns:r="http://schemas.openxmlformats.org/officeDocument/2006/relationships" xmlns:m="http://schemas.openxmlformats.org/officeDocument/2006/math" xmlns:v="urn:schemas-microsoft-com:vml" xmlns:wp14="http://schemas.microsoft.com/office/word/2010/wordprocessingDrawing" xmlns:wp="http://schemas.openxmlformats.org/drawingml/2006/wordprocessingDrawing" xmlns:w10="urn:schemas-microsoft-com:office:word" xmlns:w="http://schemas.openxmlformats.org/wordprocessingml/2006/main" xmlns:w14="http://schemas.microsoft.com/office/word/2010/wordml" xmlns:w15="http://schemas.microsoft.com/office/word/2012/wordml" xmlns:w16cex="http://schemas.microsoft.com/office/word/2018/wordml/cex" xmlns:w16cid="http://schemas.microsoft.com/office/word/2016/wordml/cid" xmlns:w16="http://schemas.microsoft.com/office/word/2018/wordml" xmlns:w16du="http://schemas.microsoft.com/office/word/2023/wordml/word16du" xmlns:w16sdtdh="http://schemas.microsoft.com/office/word/2020/wordml/sdtdatahash" xmlns:w16sdtfl="http://schemas.microsoft.com/office/word/2024/wordml/sdtformatlock" xmlns:w16se="http://schemas.microsoft.com/office/word/2015/wordml/symex" xmlns:wpg="http://schemas.microsoft.com/office/word/2010/wordprocessingGroup" xmlns:wpi="http://schemas.microsoft.com/office/word/2010/wordprocessingInk" xmlns:wne="http://schemas.microsoft.com/office/word/2006/wordml" xmlns:wps="http://schemas.microsoft.com/office/word/2010/wordprocessingShape" mc:Ignorable="w14 w15 w16se w16cid w16 w16cex w16sdtdh w16sdtfl w16du wp14">
+<w:document xmlns:wpc="http://schemas.microsoft.com/office/word/2010/wordprocessingCanvas" xmlns:cx="http://schemas.microsoft.com/office/drawing/2014/chartex" xmlns:mc="http://schemas.openxmlformats.org/markup-compatibility/2006" xmlns:o="urn:schemas-microsoft-com:office:office" xmlns:r="http://schemas.openxmlformats.org/officeDocument/2006/relationships" xmlns:m="http://schemas.openxmlformats.org/officeDocument/2006/math" xmlns:v="urn:schemas-microsoft-com:vml" xmlns:wp14="http://schemas.microsoft.com/office/word/2010/wordprocessingDrawing" xmlns:wp="http://schemas.openxmlformats.org/drawingml/2006/wordprocessingDrawing" xmlns:w10="urn:schemas-microsoft-com:office:word" xmlns:w="http://schemas.openxmlformats.org/wordprocessingml/2006/main" xmlns:w14="http://schemas.microsoft.com/office/word/2010/wordml" xmlns:w15="http://schemas.microsoft.com/office/word/2012/wordml" xmlns:w16se="http://schemas.microsoft.com/office/word/2015/wordml/symex" xmlns:wpg="http://schemas.microsoft.com/office/word/2010/wordprocessingGroup" xmlns:wpi="http://schemas.microsoft.com/office/word/2010/wordprocessingInk" xmlns:wne="http://schemas.microsoft.com/office/word/2006/wordml" xmlns:wps="http://schemas.microsoft.com/office/word/2010/wordprocessingShape" mc:Ignorable="w14 w15 w16se wp14">
   <w:body>
     <w:p/>
     <w:p>
@@ -340,6 +340,7 @@
           <w:sz w:val="24"/>
           <w:szCs w:val="24"/>
         </w:rPr>
+        <w:lastRenderedPageBreak/>
         <w:t>User account – The user must be able to create an account with a valid e-mail, username and password.</w:t>
       </w:r>
     </w:p>
@@ -620,7 +621,44 @@
           <w:sz w:val="24"/>
           <w:szCs w:val="24"/>
         </w:rPr>
-        <w:t xml:space="preserve">Award System – The system must rank the user by their score. The user must be able to gain </w:t>
+        <w:t>Award System – The system must</w:t>
+      </w:r>
+      <w:r>
+        <w:rPr>
+          <w:sz w:val="24"/>
+          <w:szCs w:val="24"/>
+        </w:rPr>
+        <w:t xml:space="preserve"> give a</w:t>
+      </w:r>
+      <w:r>
+        <w:rPr>
+          <w:sz w:val="24"/>
+          <w:szCs w:val="24"/>
+        </w:rPr>
+        <w:t xml:space="preserve"> rank the user by their </w:t>
+      </w:r>
+      <w:bookmarkStart w:id="0" w:name="_GoBack"/>
+      <w:bookmarkEnd w:id="0"/>
+      <w:r>
+        <w:rPr>
+          <w:sz w:val="24"/>
+          <w:szCs w:val="24"/>
+        </w:rPr>
+        <w:t>score (</w:t>
+      </w:r>
+      <w:r>
+        <w:rPr>
+          <w:sz w:val="24"/>
+          <w:szCs w:val="24"/>
+        </w:rPr>
+        <w:t>bronze, silver, golden)</w:t>
+      </w:r>
+      <w:r>
+        <w:rPr>
+          <w:sz w:val="24"/>
+          <w:szCs w:val="24"/>
+        </w:rPr>
+        <w:t xml:space="preserve">. The user must be able to gain </w:t>
       </w:r>
       <w:r>
         <w:rPr>
@@ -918,23 +956,7 @@
           <w:sz w:val="24"/>
           <w:szCs w:val="24"/>
         </w:rPr>
-        <w:t xml:space="preserve">The system must complete the transition between </w:t>
-      </w:r>
-      <w:proofErr w:type="gramStart"/>
-      <w:r>
-        <w:rPr>
-          <w:sz w:val="24"/>
-          <w:szCs w:val="24"/>
-        </w:rPr>
-        <w:t>pages</w:t>
-      </w:r>
-      <w:proofErr w:type="gramEnd"/>
-      <w:r>
-        <w:rPr>
-          <w:sz w:val="24"/>
-          <w:szCs w:val="24"/>
-        </w:rPr>
-        <w:t xml:space="preserve"> less than </w:t>
+        <w:t xml:space="preserve">The system must complete the transition between pages less than </w:t>
       </w:r>
       <w:r>
         <w:rPr>
@@ -1058,7 +1080,7 @@
 </file>
 
 <file path=word/endnotes.xml><?xml version="1.0" encoding="utf-8"?>
-<w:endnotes xmlns:wpc="http://schemas.microsoft.com/office/word/2010/wordprocessingCanvas" xmlns:cx="http://schemas.microsoft.com/office/drawing/2014/chartex" xmlns:cx1="http://schemas.microsoft.com/office/drawing/2015/9/8/chartex" xmlns:cx2="http://schemas.microsoft.com/office/drawing/2015/10/21/chartex" xmlns:cx3="http://schemas.microsoft.com/office/drawing/2016/5/9/chartex" xmlns:cx4="http://schemas.microsoft.com/office/drawing/2016/5/10/chartex" xmlns:cx5="http://schemas.microsoft.com/office/drawing/2016/5/11/chartex" xmlns:cx6="http://schemas.microsoft.com/office/drawing/2016/5/12/chartex" xmlns:cx7="http://schemas.microsoft.com/office/drawing/2016/5/13/chartex" xmlns:cx8="http://schemas.microsoft.com/office/drawing/2016/5/14/chartex" xmlns:mc="http://schemas.openxmlformats.org/markup-compatibility/2006" xmlns:aink="http://schemas.microsoft.com/office/drawing/2016/ink" xmlns:am3d="http://schemas.microsoft.com/office/drawing/2017/model3d" xmlns:o="urn:schemas-microsoft-com:office:office" xmlns:oel="http://schemas.microsoft.com/office/2019/extlst" xmlns:r="http://schemas.openxmlformats.org/officeDocument/2006/relationships" xmlns:m="http://schemas.openxmlformats.org/officeDocument/2006/math" xmlns:v="urn:schemas-microsoft-com:vml" xmlns:wp14="http://schemas.microsoft.com/office/word/2010/wordprocessingDrawing" xmlns:wp="http://schemas.openxmlformats.org/drawingml/2006/wordprocessingDrawing" xmlns:w10="urn:schemas-microsoft-com:office:word" xmlns:w="http://schemas.openxmlformats.org/wordprocessingml/2006/main" xmlns:w14="http://schemas.microsoft.com/office/word/2010/wordml" xmlns:w15="http://schemas.microsoft.com/office/word/2012/wordml" xmlns:w16cex="http://schemas.microsoft.com/office/word/2018/wordml/cex" xmlns:w16cid="http://schemas.microsoft.com/office/word/2016/wordml/cid" xmlns:w16="http://schemas.microsoft.com/office/word/2018/wordml" xmlns:w16du="http://schemas.microsoft.com/office/word/2023/wordml/word16du" xmlns:w16sdtdh="http://schemas.microsoft.com/office/word/2020/wordml/sdtdatahash" xmlns:w16sdtfl="http://schemas.microsoft.com/office/word/2024/wordml/sdtformatlock" xmlns:w16se="http://schemas.microsoft.com/office/word/2015/wordml/symex" xmlns:wpg="http://schemas.microsoft.com/office/word/2010/wordprocessingGroup" xmlns:wpi="http://schemas.microsoft.com/office/word/2010/wordprocessingInk" xmlns:wne="http://schemas.microsoft.com/office/word/2006/wordml" xmlns:wps="http://schemas.microsoft.com/office/word/2010/wordprocessingShape" mc:Ignorable="w14 w15 w16se w16cid w16 w16cex w16sdtdh w16sdtfl w16du wp14">
+<w:endnotes xmlns:wpc="http://schemas.microsoft.com/office/word/2010/wordprocessingCanvas" xmlns:cx="http://schemas.microsoft.com/office/drawing/2014/chartex" xmlns:mc="http://schemas.openxmlformats.org/markup-compatibility/2006" xmlns:o="urn:schemas-microsoft-com:office:office" xmlns:r="http://schemas.openxmlformats.org/officeDocument/2006/relationships" xmlns:m="http://schemas.openxmlformats.org/officeDocument/2006/math" xmlns:v="urn:schemas-microsoft-com:vml" xmlns:wp14="http://schemas.microsoft.com/office/word/2010/wordprocessingDrawing" xmlns:wp="http://schemas.openxmlformats.org/drawingml/2006/wordprocessingDrawing" xmlns:w10="urn:schemas-microsoft-com:office:word" xmlns:w="http://schemas.openxmlformats.org/wordprocessingml/2006/main" xmlns:w14="http://schemas.microsoft.com/office/word/2010/wordml" xmlns:w15="http://schemas.microsoft.com/office/word/2012/wordml" xmlns:w16se="http://schemas.microsoft.com/office/word/2015/wordml/symex" xmlns:wpg="http://schemas.microsoft.com/office/word/2010/wordprocessingGroup" xmlns:wpi="http://schemas.microsoft.com/office/word/2010/wordprocessingInk" xmlns:wne="http://schemas.microsoft.com/office/word/2006/wordml" xmlns:wps="http://schemas.microsoft.com/office/word/2010/wordprocessingShape" mc:Ignorable="w14 w15 w16se wp14">
   <w:endnote w:type="separator" w:id="-1">
     <w:p>
       <w:pPr>
@@ -1083,7 +1105,7 @@
 </file>
 
 <file path=word/footnotes.xml><?xml version="1.0" encoding="utf-8"?>
-<w:footnotes xmlns:wpc="http://schemas.microsoft.com/office/word/2010/wordprocessingCanvas" xmlns:cx="http://schemas.microsoft.com/office/drawing/2014/chartex" xmlns:cx1="http://schemas.microsoft.com/office/drawing/2015/9/8/chartex" xmlns:cx2="http://schemas.microsoft.com/office/drawing/2015/10/21/chartex" xmlns:cx3="http://schemas.microsoft.com/office/drawing/2016/5/9/chartex" xmlns:cx4="http://schemas.microsoft.com/office/drawing/2016/5/10/chartex" xmlns:cx5="http://schemas.microsoft.com/office/drawing/2016/5/11/chartex" xmlns:cx6="http://schemas.microsoft.com/office/drawing/2016/5/12/chartex" xmlns:cx7="http://schemas.microsoft.com/office/drawing/2016/5/13/chartex" xmlns:cx8="http://schemas.microsoft.com/office/drawing/2016/5/14/chartex" xmlns:mc="http://schemas.openxmlformats.org/markup-compatibility/2006" xmlns:aink="http://schemas.microsoft.com/office/drawing/2016/ink" xmlns:am3d="http://schemas.microsoft.com/office/drawing/2017/model3d" xmlns:o="urn:schemas-microsoft-com:office:office" xmlns:oel="http://schemas.microsoft.com/office/2019/extlst" xmlns:r="http://schemas.openxmlformats.org/officeDocument/2006/relationships" xmlns:m="http://schemas.openxmlformats.org/officeDocument/2006/math" xmlns:v="urn:schemas-microsoft-com:vml" xmlns:wp14="http://schemas.microsoft.com/office/word/2010/wordprocessingDrawing" xmlns:wp="http://schemas.openxmlformats.org/drawingml/2006/wordprocessingDrawing" xmlns:w10="urn:schemas-microsoft-com:office:word" xmlns:w="http://schemas.openxmlformats.org/wordprocessingml/2006/main" xmlns:w14="http://schemas.microsoft.com/office/word/2010/wordml" xmlns:w15="http://schemas.microsoft.com/office/word/2012/wordml" xmlns:w16cex="http://schemas.microsoft.com/office/word/2018/wordml/cex" xmlns:w16cid="http://schemas.microsoft.com/office/word/2016/wordml/cid" xmlns:w16="http://schemas.microsoft.com/office/word/2018/wordml" xmlns:w16du="http://schemas.microsoft.com/office/word/2023/wordml/word16du" xmlns:w16sdtdh="http://schemas.microsoft.com/office/word/2020/wordml/sdtdatahash" xmlns:w16sdtfl="http://schemas.microsoft.com/office/word/2024/wordml/sdtformatlock" xmlns:w16se="http://schemas.microsoft.com/office/word/2015/wordml/symex" xmlns:wpg="http://schemas.microsoft.com/office/word/2010/wordprocessingGroup" xmlns:wpi="http://schemas.microsoft.com/office/word/2010/wordprocessingInk" xmlns:wne="http://schemas.microsoft.com/office/word/2006/wordml" xmlns:wps="http://schemas.microsoft.com/office/word/2010/wordprocessingShape" mc:Ignorable="w14 w15 w16se w16cid w16 w16cex w16sdtdh w16sdtfl w16du wp14">
+<w:footnotes xmlns:wpc="http://schemas.microsoft.com/office/word/2010/wordprocessingCanvas" xmlns:cx="http://schemas.microsoft.com/office/drawing/2014/chartex" xmlns:mc="http://schemas.openxmlformats.org/markup-compatibility/2006" xmlns:o="urn:schemas-microsoft-com:office:office" xmlns:r="http://schemas.openxmlformats.org/officeDocument/2006/relationships" xmlns:m="http://schemas.openxmlformats.org/officeDocument/2006/math" xmlns:v="urn:schemas-microsoft-com:vml" xmlns:wp14="http://schemas.microsoft.com/office/word/2010/wordprocessingDrawing" xmlns:wp="http://schemas.openxmlformats.org/drawingml/2006/wordprocessingDrawing" xmlns:w10="urn:schemas-microsoft-com:office:word" xmlns:w="http://schemas.openxmlformats.org/wordprocessingml/2006/main" xmlns:w14="http://schemas.microsoft.com/office/word/2010/wordml" xmlns:w15="http://schemas.microsoft.com/office/word/2012/wordml" xmlns:w16se="http://schemas.microsoft.com/office/word/2015/wordml/symex" xmlns:wpg="http://schemas.microsoft.com/office/word/2010/wordprocessingGroup" xmlns:wpi="http://schemas.microsoft.com/office/word/2010/wordprocessingInk" xmlns:wne="http://schemas.microsoft.com/office/word/2006/wordml" xmlns:wps="http://schemas.microsoft.com/office/word/2010/wordprocessingShape" mc:Ignorable="w14 w15 w16se wp14">
   <w:footnote w:type="separator" w:id="-1">
     <w:p>
       <w:pPr>
@@ -1108,7 +1130,7 @@
 </file>
 
 <file path=word/numbering.xml><?xml version="1.0" encoding="utf-8"?>
-<w:numbering xmlns:wpc="http://schemas.microsoft.com/office/word/2010/wordprocessingCanvas" xmlns:cx="http://schemas.microsoft.com/office/drawing/2014/chartex" xmlns:cx1="http://schemas.microsoft.com/office/drawing/2015/9/8/chartex" xmlns:cx2="http://schemas.microsoft.com/office/drawing/2015/10/21/chartex" xmlns:cx3="http://schemas.microsoft.com/office/drawing/2016/5/9/chartex" xmlns:cx4="http://schemas.microsoft.com/office/drawing/2016/5/10/chartex" xmlns:cx5="http://schemas.microsoft.com/office/drawing/2016/5/11/chartex" xmlns:cx6="http://schemas.microsoft.com/office/drawing/2016/5/12/chartex" xmlns:cx7="http://schemas.microsoft.com/office/drawing/2016/5/13/chartex" xmlns:cx8="http://schemas.microsoft.com/office/drawing/2016/5/14/chartex" xmlns:mc="http://schemas.openxmlformats.org/markup-compatibility/2006" xmlns:aink="http://schemas.microsoft.com/office/drawing/2016/ink" xmlns:am3d="http://schemas.microsoft.com/office/drawing/2017/model3d" xmlns:o="urn:schemas-microsoft-com:office:office" xmlns:oel="http://schemas.microsoft.com/office/2019/extlst" xmlns:r="http://schemas.openxmlformats.org/officeDocument/2006/relationships" xmlns:m="http://schemas.openxmlformats.org/officeDocument/2006/math" xmlns:v="urn:schemas-microsoft-com:vml" xmlns:wp14="http://schemas.microsoft.com/office/word/2010/wordprocessingDrawing" xmlns:wp="http://schemas.openxmlformats.org/drawingml/2006/wordprocessingDrawing" xmlns:w10="urn:schemas-microsoft-com:office:word" xmlns:w="http://schemas.openxmlformats.org/wordprocessingml/2006/main" xmlns:w14="http://schemas.microsoft.com/office/word/2010/wordml" xmlns:w15="http://schemas.microsoft.com/office/word/2012/wordml" xmlns:w16cex="http://schemas.microsoft.com/office/word/2018/wordml/cex" xmlns:w16cid="http://schemas.microsoft.com/office/word/2016/wordml/cid" xmlns:w16="http://schemas.microsoft.com/office/word/2018/wordml" xmlns:w16du="http://schemas.microsoft.com/office/word/2023/wordml/word16du" xmlns:w16sdtdh="http://schemas.microsoft.com/office/word/2020/wordml/sdtdatahash" xmlns:w16sdtfl="http://schemas.microsoft.com/office/word/2024/wordml/sdtformatlock" xmlns:w16se="http://schemas.microsoft.com/office/word/2015/wordml/symex" xmlns:wpg="http://schemas.microsoft.com/office/word/2010/wordprocessingGroup" xmlns:wpi="http://schemas.microsoft.com/office/word/2010/wordprocessingInk" xmlns:wne="http://schemas.microsoft.com/office/word/2006/wordml" xmlns:wps="http://schemas.microsoft.com/office/word/2010/wordprocessingShape" mc:Ignorable="w14 w15 w16se w16cid w16 w16cex w16sdtdh w16sdtfl w16du wp14">
+<w:numbering xmlns:wpc="http://schemas.microsoft.com/office/word/2010/wordprocessingCanvas" xmlns:cx="http://schemas.microsoft.com/office/drawing/2014/chartex" xmlns:mc="http://schemas.openxmlformats.org/markup-compatibility/2006" xmlns:o="urn:schemas-microsoft-com:office:office" xmlns:r="http://schemas.openxmlformats.org/officeDocument/2006/relationships" xmlns:m="http://schemas.openxmlformats.org/officeDocument/2006/math" xmlns:v="urn:schemas-microsoft-com:vml" xmlns:wp14="http://schemas.microsoft.com/office/word/2010/wordprocessingDrawing" xmlns:wp="http://schemas.openxmlformats.org/drawingml/2006/wordprocessingDrawing" xmlns:w10="urn:schemas-microsoft-com:office:word" xmlns:w="http://schemas.openxmlformats.org/wordprocessingml/2006/main" xmlns:w14="http://schemas.microsoft.com/office/word/2010/wordml" xmlns:w15="http://schemas.microsoft.com/office/word/2012/wordml" xmlns:w16se="http://schemas.microsoft.com/office/word/2015/wordml/symex" xmlns:wpg="http://schemas.microsoft.com/office/word/2010/wordprocessingGroup" xmlns:wpi="http://schemas.microsoft.com/office/word/2010/wordprocessingInk" xmlns:wne="http://schemas.microsoft.com/office/word/2006/wordml" xmlns:wps="http://schemas.microsoft.com/office/word/2010/wordprocessingShape" mc:Ignorable="w14 w15 w16se wp14">
   <w:abstractNum w:abstractNumId="0" w15:restartNumberingAfterBreak="0">
     <w:nsid w:val="30723A6E"/>
     <w:multiLevelType w:val="hybridMultilevel"/>
@@ -1824,35 +1846,35 @@
       </w:rPr>
     </w:lvl>
   </w:abstractNum>
-  <w:num w:numId="1" w16cid:durableId="944583405">
+  <w:num w:numId="1">
     <w:abstractNumId w:val="7"/>
   </w:num>
-  <w:num w:numId="2" w16cid:durableId="342971687">
+  <w:num w:numId="2">
     <w:abstractNumId w:val="5"/>
   </w:num>
-  <w:num w:numId="3" w16cid:durableId="1596279795">
+  <w:num w:numId="3">
     <w:abstractNumId w:val="6"/>
   </w:num>
-  <w:num w:numId="4" w16cid:durableId="1136995897">
+  <w:num w:numId="4">
     <w:abstractNumId w:val="3"/>
   </w:num>
-  <w:num w:numId="5" w16cid:durableId="592053941">
+  <w:num w:numId="5">
     <w:abstractNumId w:val="4"/>
   </w:num>
-  <w:num w:numId="6" w16cid:durableId="1396663968">
+  <w:num w:numId="6">
     <w:abstractNumId w:val="2"/>
   </w:num>
-  <w:num w:numId="7" w16cid:durableId="79105188">
+  <w:num w:numId="7">
     <w:abstractNumId w:val="0"/>
   </w:num>
-  <w:num w:numId="8" w16cid:durableId="900216005">
+  <w:num w:numId="8">
     <w:abstractNumId w:val="1"/>
   </w:num>
 </w:numbering>
 </file>
 
 <file path=word/styles.xml><?xml version="1.0" encoding="utf-8"?>
-<w:styles xmlns:mc="http://schemas.openxmlformats.org/markup-compatibility/2006" xmlns:r="http://schemas.openxmlformats.org/officeDocument/2006/relationships" xmlns:w="http://schemas.openxmlformats.org/wordprocessingml/2006/main" xmlns:w14="http://schemas.microsoft.com/office/word/2010/wordml" xmlns:w15="http://schemas.microsoft.com/office/word/2012/wordml" xmlns:w16cex="http://schemas.microsoft.com/office/word/2018/wordml/cex" xmlns:w16cid="http://schemas.microsoft.com/office/word/2016/wordml/cid" xmlns:w16="http://schemas.microsoft.com/office/word/2018/wordml" xmlns:w16du="http://schemas.microsoft.com/office/word/2023/wordml/word16du" xmlns:w16sdtdh="http://schemas.microsoft.com/office/word/2020/wordml/sdtdatahash" xmlns:w16sdtfl="http://schemas.microsoft.com/office/word/2024/wordml/sdtformatlock" xmlns:w16se="http://schemas.microsoft.com/office/word/2015/wordml/symex" mc:Ignorable="w14 w15 w16se w16cid w16 w16cex w16sdtdh w16sdtfl w16du">
+<w:styles xmlns:mc="http://schemas.openxmlformats.org/markup-compatibility/2006" xmlns:r="http://schemas.openxmlformats.org/officeDocument/2006/relationships" xmlns:w="http://schemas.openxmlformats.org/wordprocessingml/2006/main" xmlns:w14="http://schemas.microsoft.com/office/word/2010/wordml" xmlns:w15="http://schemas.microsoft.com/office/word/2012/wordml" xmlns:w16se="http://schemas.microsoft.com/office/word/2015/wordml/symex" mc:Ignorable="w14 w15 w16se">
   <w:docDefaults>
     <w:rPrDefault>
       <w:rPr>
@@ -1868,7 +1890,7 @@
       </w:pPr>
     </w:pPrDefault>
   </w:docDefaults>
-  <w:latentStyles w:defLockedState="0" w:defUIPriority="99" w:defSemiHidden="0" w:defUnhideWhenUsed="0" w:defQFormat="0" w:count="376">
+  <w:latentStyles w:defLockedState="0" w:defUIPriority="99" w:defSemiHidden="0" w:defUnhideWhenUsed="0" w:defQFormat="0" w:count="371">
     <w:lsdException w:name="Normal" w:uiPriority="0" w:qFormat="1"/>
     <w:lsdException w:name="heading 1" w:uiPriority="9" w:qFormat="1"/>
     <w:lsdException w:name="heading 2" w:semiHidden="1" w:uiPriority="9" w:unhideWhenUsed="1" w:qFormat="1"/>
@@ -2240,11 +2262,6 @@
     <w:lsdException w:name="List Table 5 Dark Accent 6" w:uiPriority="50"/>
     <w:lsdException w:name="List Table 6 Colorful Accent 6" w:uiPriority="51"/>
     <w:lsdException w:name="List Table 7 Colorful Accent 6" w:uiPriority="52"/>
-    <w:lsdException w:name="Mention" w:semiHidden="1" w:unhideWhenUsed="1"/>
-    <w:lsdException w:name="Smart Hyperlink" w:semiHidden="1" w:unhideWhenUsed="1"/>
-    <w:lsdException w:name="Hashtag" w:semiHidden="1" w:unhideWhenUsed="1"/>
-    <w:lsdException w:name="Unresolved Mention" w:semiHidden="1" w:unhideWhenUsed="1"/>
-    <w:lsdException w:name="Smart Link" w:semiHidden="1" w:unhideWhenUsed="1"/>
   </w:latentStyles>
   <w:style w:type="paragraph" w:default="1" w:styleId="Normal">
     <w:name w:val="Normal"/>

</xml_diff>

<commit_message>
Ambiguous statement in FR8 is updated
</commit_message>
<xml_diff>
--- a/Assignment2/Requirements_v2.docx
+++ b/Assignment2/Requirements_v2.docx
@@ -635,10 +635,38 @@
           <w:sz w:val="24"/>
           <w:szCs w:val="24"/>
         </w:rPr>
-        <w:t xml:space="preserve"> rank the user by their </w:t>
+        <w:t xml:space="preserve"> rank </w:t>
+      </w:r>
+      <w:r>
+        <w:rPr>
+          <w:sz w:val="24"/>
+          <w:szCs w:val="24"/>
+        </w:rPr>
+        <w:t xml:space="preserve">to </w:t>
+      </w:r>
+      <w:r>
+        <w:rPr>
+          <w:sz w:val="24"/>
+          <w:szCs w:val="24"/>
+        </w:rPr>
+        <w:t>the user according</w:t>
       </w:r>
       <w:bookmarkStart w:id="0" w:name="_GoBack"/>
       <w:bookmarkEnd w:id="0"/>
+      <w:r>
+        <w:rPr>
+          <w:sz w:val="24"/>
+          <w:szCs w:val="24"/>
+        </w:rPr>
+        <w:t xml:space="preserve"> to</w:t>
+      </w:r>
+      <w:r>
+        <w:rPr>
+          <w:sz w:val="24"/>
+          <w:szCs w:val="24"/>
+        </w:rPr>
+        <w:t xml:space="preserve"> their </w:t>
+      </w:r>
       <w:r>
         <w:rPr>
           <w:sz w:val="24"/>

</xml_diff>